<commit_message>
Made more graphs based on Steph and Pat's suggestions
</commit_message>
<xml_diff>
--- a/GCReW Symposium Ideas.docx
+++ b/GCReW Symposium Ideas.docx
@@ -6,8 +6,13 @@
       <w:pPr>
         <w:ind w:left="720" w:hanging="360"/>
       </w:pPr>
-      <w:r>
-        <w:t>GCReW Symposium Poster Ideas</w:t>
+      <w:proofErr w:type="spellStart"/>
+      <w:r>
+        <w:t>GCReW</w:t>
+      </w:r>
+      <w:proofErr w:type="spellEnd"/>
+      <w:r>
+        <w:t xml:space="preserve"> Symposium Poster Ideas</w:t>
       </w:r>
     </w:p>
     <w:p>
@@ -53,10 +58,501 @@
       </w:r>
     </w:p>
     <w:p/>
+    <w:p>
+      <w:r>
+        <w:br w:type="page"/>
+      </w:r>
+    </w:p>
+    <w:p>
+      <w:pPr>
+        <w:rPr>
+          <w:b/>
+          <w:bCs/>
+        </w:rPr>
+      </w:pPr>
+      <w:r>
+        <w:rPr>
+          <w:b/>
+          <w:bCs/>
+        </w:rPr>
+        <w:lastRenderedPageBreak/>
+        <w:t>NEWER</w:t>
+      </w:r>
+      <w:r>
+        <w:rPr>
+          <w:b/>
+          <w:bCs/>
+        </w:rPr>
+        <w:t xml:space="preserve"> GRAPHS:</w:t>
+      </w:r>
+    </w:p>
+    <w:p>
+      <w:r>
+        <w:t xml:space="preserve">Plotted SO4/Cl through time as scatterplots: </w:t>
+      </w:r>
+      <w:r>
+        <w:t xml:space="preserve">There seems to be a seasonal trend but not so much a trend across years. </w:t>
+      </w:r>
+    </w:p>
+    <w:p>
+      <w:r>
+        <w:rPr>
+          <w:noProof/>
+        </w:rPr>
+        <w:drawing>
+          <wp:inline distT="0" distB="0" distL="0" distR="0" wp14:anchorId="513DBC8F" wp14:editId="384DD942">
+            <wp:extent cx="8221345" cy="4931410"/>
+            <wp:effectExtent l="0" t="0" r="8255" b="2540"/>
+            <wp:docPr id="463213830" name="Picture 4"/>
+            <wp:cNvGraphicFramePr>
+              <a:graphicFrameLocks xmlns:a="http://schemas.openxmlformats.org/drawingml/2006/main" noChangeAspect="1"/>
+            </wp:cNvGraphicFramePr>
+            <a:graphic xmlns:a="http://schemas.openxmlformats.org/drawingml/2006/main">
+              <a:graphicData uri="http://schemas.openxmlformats.org/drawingml/2006/picture">
+                <pic:pic xmlns:pic="http://schemas.openxmlformats.org/drawingml/2006/picture">
+                  <pic:nvPicPr>
+                    <pic:cNvPr id="0" name="Picture 4"/>
+                    <pic:cNvPicPr>
+                      <a:picLocks noChangeAspect="1" noChangeArrowheads="1"/>
+                    </pic:cNvPicPr>
+                  </pic:nvPicPr>
+                  <pic:blipFill>
+                    <a:blip r:embed="rId5" cstate="print">
+                      <a:extLst>
+                        <a:ext uri="{28A0092B-C50C-407E-A947-70E740481C1C}">
+                          <a14:useLocalDpi xmlns:a14="http://schemas.microsoft.com/office/drawing/2010/main" val="0"/>
+                        </a:ext>
+                      </a:extLst>
+                    </a:blip>
+                    <a:srcRect/>
+                    <a:stretch>
+                      <a:fillRect/>
+                    </a:stretch>
+                  </pic:blipFill>
+                  <pic:spPr bwMode="auto">
+                    <a:xfrm>
+                      <a:off x="0" y="0"/>
+                      <a:ext cx="8221345" cy="4931410"/>
+                    </a:xfrm>
+                    <a:prstGeom prst="rect">
+                      <a:avLst/>
+                    </a:prstGeom>
+                    <a:noFill/>
+                    <a:ln>
+                      <a:noFill/>
+                    </a:ln>
+                  </pic:spPr>
+                </pic:pic>
+              </a:graphicData>
+            </a:graphic>
+          </wp:inline>
+        </w:drawing>
+      </w:r>
+    </w:p>
+    <w:p>
+      <w:r>
+        <w:rPr>
+          <w:noProof/>
+        </w:rPr>
+        <w:lastRenderedPageBreak/>
+        <w:drawing>
+          <wp:inline distT="0" distB="0" distL="0" distR="0" wp14:anchorId="0645901A" wp14:editId="4B696611">
+            <wp:extent cx="8221345" cy="4931410"/>
+            <wp:effectExtent l="0" t="0" r="8255" b="2540"/>
+            <wp:docPr id="467753390" name="Picture 5"/>
+            <wp:cNvGraphicFramePr>
+              <a:graphicFrameLocks xmlns:a="http://schemas.openxmlformats.org/drawingml/2006/main" noChangeAspect="1"/>
+            </wp:cNvGraphicFramePr>
+            <a:graphic xmlns:a="http://schemas.openxmlformats.org/drawingml/2006/main">
+              <a:graphicData uri="http://schemas.openxmlformats.org/drawingml/2006/picture">
+                <pic:pic xmlns:pic="http://schemas.openxmlformats.org/drawingml/2006/picture">
+                  <pic:nvPicPr>
+                    <pic:cNvPr id="0" name="Picture 5"/>
+                    <pic:cNvPicPr>
+                      <a:picLocks noChangeAspect="1" noChangeArrowheads="1"/>
+                    </pic:cNvPicPr>
+                  </pic:nvPicPr>
+                  <pic:blipFill>
+                    <a:blip r:embed="rId6" cstate="print">
+                      <a:extLst>
+                        <a:ext uri="{28A0092B-C50C-407E-A947-70E740481C1C}">
+                          <a14:useLocalDpi xmlns:a14="http://schemas.microsoft.com/office/drawing/2010/main" val="0"/>
+                        </a:ext>
+                      </a:extLst>
+                    </a:blip>
+                    <a:srcRect/>
+                    <a:stretch>
+                      <a:fillRect/>
+                    </a:stretch>
+                  </pic:blipFill>
+                  <pic:spPr bwMode="auto">
+                    <a:xfrm>
+                      <a:off x="0" y="0"/>
+                      <a:ext cx="8221345" cy="4931410"/>
+                    </a:xfrm>
+                    <a:prstGeom prst="rect">
+                      <a:avLst/>
+                    </a:prstGeom>
+                    <a:noFill/>
+                    <a:ln>
+                      <a:noFill/>
+                    </a:ln>
+                  </pic:spPr>
+                </pic:pic>
+              </a:graphicData>
+            </a:graphic>
+          </wp:inline>
+        </w:drawing>
+      </w:r>
+    </w:p>
     <w:p/>
     <w:p>
       <w:r>
+        <w:br w:type="page"/>
+      </w:r>
+    </w:p>
+    <w:p>
+      <w:r>
         <w:lastRenderedPageBreak/>
+        <w:t>DOC vs SO4/Cl for only Transition Zones</w:t>
+      </w:r>
+      <w:r>
+        <w:t xml:space="preserve">: Looks like a generally </w:t>
+      </w:r>
+      <w:r>
+        <w:t>inverse</w:t>
+      </w:r>
+      <w:r>
+        <w:t xml:space="preserve"> relationship</w:t>
+      </w:r>
+      <w:r>
+        <w:t xml:space="preserve">. </w:t>
+      </w:r>
+    </w:p>
+    <w:p>
+      <w:r>
+        <w:rPr>
+          <w:noProof/>
+        </w:rPr>
+        <w:drawing>
+          <wp:inline distT="0" distB="0" distL="0" distR="0" wp14:anchorId="356AA856" wp14:editId="1635983D">
+            <wp:extent cx="8229600" cy="4937760"/>
+            <wp:effectExtent l="0" t="0" r="0" b="0"/>
+            <wp:docPr id="527517431" name="Picture 6"/>
+            <wp:cNvGraphicFramePr>
+              <a:graphicFrameLocks xmlns:a="http://schemas.openxmlformats.org/drawingml/2006/main" noChangeAspect="1"/>
+            </wp:cNvGraphicFramePr>
+            <a:graphic xmlns:a="http://schemas.openxmlformats.org/drawingml/2006/main">
+              <a:graphicData uri="http://schemas.openxmlformats.org/drawingml/2006/picture">
+                <pic:pic xmlns:pic="http://schemas.openxmlformats.org/drawingml/2006/picture">
+                  <pic:nvPicPr>
+                    <pic:cNvPr id="0" name="Picture 6"/>
+                    <pic:cNvPicPr>
+                      <a:picLocks noChangeAspect="1" noChangeArrowheads="1"/>
+                    </pic:cNvPicPr>
+                  </pic:nvPicPr>
+                  <pic:blipFill>
+                    <a:blip r:embed="rId7" cstate="print">
+                      <a:extLst>
+                        <a:ext uri="{28A0092B-C50C-407E-A947-70E740481C1C}">
+                          <a14:useLocalDpi xmlns:a14="http://schemas.microsoft.com/office/drawing/2010/main" val="0"/>
+                        </a:ext>
+                      </a:extLst>
+                    </a:blip>
+                    <a:srcRect/>
+                    <a:stretch>
+                      <a:fillRect/>
+                    </a:stretch>
+                  </pic:blipFill>
+                  <pic:spPr bwMode="auto">
+                    <a:xfrm>
+                      <a:off x="0" y="0"/>
+                      <a:ext cx="8229600" cy="4937760"/>
+                    </a:xfrm>
+                    <a:prstGeom prst="rect">
+                      <a:avLst/>
+                    </a:prstGeom>
+                    <a:noFill/>
+                    <a:ln>
+                      <a:noFill/>
+                    </a:ln>
+                  </pic:spPr>
+                </pic:pic>
+              </a:graphicData>
+            </a:graphic>
+          </wp:inline>
+        </w:drawing>
+      </w:r>
+    </w:p>
+    <w:p>
+      <w:r>
+        <w:rPr>
+          <w:noProof/>
+        </w:rPr>
+        <w:lastRenderedPageBreak/>
+        <w:drawing>
+          <wp:inline distT="0" distB="0" distL="0" distR="0" wp14:anchorId="5F176FA7" wp14:editId="758B479A">
+            <wp:extent cx="8229600" cy="4937760"/>
+            <wp:effectExtent l="0" t="0" r="0" b="0"/>
+            <wp:docPr id="1644211787" name="Picture 7"/>
+            <wp:cNvGraphicFramePr>
+              <a:graphicFrameLocks xmlns:a="http://schemas.openxmlformats.org/drawingml/2006/main" noChangeAspect="1"/>
+            </wp:cNvGraphicFramePr>
+            <a:graphic xmlns:a="http://schemas.openxmlformats.org/drawingml/2006/main">
+              <a:graphicData uri="http://schemas.openxmlformats.org/drawingml/2006/picture">
+                <pic:pic xmlns:pic="http://schemas.openxmlformats.org/drawingml/2006/picture">
+                  <pic:nvPicPr>
+                    <pic:cNvPr id="0" name="Picture 7"/>
+                    <pic:cNvPicPr>
+                      <a:picLocks noChangeAspect="1" noChangeArrowheads="1"/>
+                    </pic:cNvPicPr>
+                  </pic:nvPicPr>
+                  <pic:blipFill>
+                    <a:blip r:embed="rId8" cstate="print">
+                      <a:extLst>
+                        <a:ext uri="{28A0092B-C50C-407E-A947-70E740481C1C}">
+                          <a14:useLocalDpi xmlns:a14="http://schemas.microsoft.com/office/drawing/2010/main" val="0"/>
+                        </a:ext>
+                      </a:extLst>
+                    </a:blip>
+                    <a:srcRect/>
+                    <a:stretch>
+                      <a:fillRect/>
+                    </a:stretch>
+                  </pic:blipFill>
+                  <pic:spPr bwMode="auto">
+                    <a:xfrm>
+                      <a:off x="0" y="0"/>
+                      <a:ext cx="8229600" cy="4937760"/>
+                    </a:xfrm>
+                    <a:prstGeom prst="rect">
+                      <a:avLst/>
+                    </a:prstGeom>
+                    <a:noFill/>
+                    <a:ln>
+                      <a:noFill/>
+                    </a:ln>
+                  </pic:spPr>
+                </pic:pic>
+              </a:graphicData>
+            </a:graphic>
+          </wp:inline>
+        </w:drawing>
+      </w:r>
+    </w:p>
+    <w:p/>
+    <w:p/>
+    <w:p/>
+    <w:p>
+      <w:r>
+        <w:lastRenderedPageBreak/>
+        <w:t xml:space="preserve">Graphed SO4 vs H2S in Transition Zones: </w:t>
+      </w:r>
+      <w:r>
+        <w:t xml:space="preserve">It seems to be a generally inverse relationship, as expected. </w:t>
+      </w:r>
+    </w:p>
+    <w:p>
+      <w:r>
+        <w:rPr>
+          <w:noProof/>
+        </w:rPr>
+        <w:drawing>
+          <wp:inline distT="0" distB="0" distL="0" distR="0" wp14:anchorId="5C88333E" wp14:editId="7C5080E2">
+            <wp:extent cx="8229600" cy="4936490"/>
+            <wp:effectExtent l="0" t="0" r="0" b="0"/>
+            <wp:docPr id="174758582" name="Picture 9"/>
+            <wp:cNvGraphicFramePr>
+              <a:graphicFrameLocks xmlns:a="http://schemas.openxmlformats.org/drawingml/2006/main" noChangeAspect="1"/>
+            </wp:cNvGraphicFramePr>
+            <a:graphic xmlns:a="http://schemas.openxmlformats.org/drawingml/2006/main">
+              <a:graphicData uri="http://schemas.openxmlformats.org/drawingml/2006/picture">
+                <pic:pic xmlns:pic="http://schemas.openxmlformats.org/drawingml/2006/picture">
+                  <pic:nvPicPr>
+                    <pic:cNvPr id="0" name="Picture 9"/>
+                    <pic:cNvPicPr>
+                      <a:picLocks noChangeAspect="1" noChangeArrowheads="1"/>
+                    </pic:cNvPicPr>
+                  </pic:nvPicPr>
+                  <pic:blipFill>
+                    <a:blip r:embed="rId9" cstate="print">
+                      <a:extLst>
+                        <a:ext uri="{28A0092B-C50C-407E-A947-70E740481C1C}">
+                          <a14:useLocalDpi xmlns:a14="http://schemas.microsoft.com/office/drawing/2010/main" val="0"/>
+                        </a:ext>
+                      </a:extLst>
+                    </a:blip>
+                    <a:srcRect/>
+                    <a:stretch>
+                      <a:fillRect/>
+                    </a:stretch>
+                  </pic:blipFill>
+                  <pic:spPr bwMode="auto">
+                    <a:xfrm>
+                      <a:off x="0" y="0"/>
+                      <a:ext cx="8229600" cy="4936490"/>
+                    </a:xfrm>
+                    <a:prstGeom prst="rect">
+                      <a:avLst/>
+                    </a:prstGeom>
+                    <a:noFill/>
+                    <a:ln>
+                      <a:noFill/>
+                    </a:ln>
+                  </pic:spPr>
+                </pic:pic>
+              </a:graphicData>
+            </a:graphic>
+          </wp:inline>
+        </w:drawing>
+      </w:r>
+    </w:p>
+    <w:p/>
+    <w:p/>
+    <w:p>
+      <w:r>
+        <w:lastRenderedPageBreak/>
+        <w:t>H2S and SO4 vs Depth</w:t>
+      </w:r>
+      <w:r>
+        <w:t xml:space="preserve">: </w:t>
+      </w:r>
+      <w:r>
+        <w:t xml:space="preserve">Looks like SO4 decreases and H2S increases with depth. </w:t>
+      </w:r>
+    </w:p>
+    <w:p>
+      <w:r>
+        <w:rPr>
+          <w:noProof/>
+        </w:rPr>
+        <w:drawing>
+          <wp:inline distT="0" distB="0" distL="0" distR="0" wp14:anchorId="76AD92EF" wp14:editId="6FC98732">
+            <wp:extent cx="8229600" cy="4936490"/>
+            <wp:effectExtent l="0" t="0" r="0" b="0"/>
+            <wp:docPr id="1994057191" name="Picture 1"/>
+            <wp:cNvGraphicFramePr>
+              <a:graphicFrameLocks xmlns:a="http://schemas.openxmlformats.org/drawingml/2006/main" noChangeAspect="1"/>
+            </wp:cNvGraphicFramePr>
+            <a:graphic xmlns:a="http://schemas.openxmlformats.org/drawingml/2006/main">
+              <a:graphicData uri="http://schemas.openxmlformats.org/drawingml/2006/picture">
+                <pic:pic xmlns:pic="http://schemas.openxmlformats.org/drawingml/2006/picture">
+                  <pic:nvPicPr>
+                    <pic:cNvPr id="0" name="Picture 1"/>
+                    <pic:cNvPicPr>
+                      <a:picLocks noChangeAspect="1" noChangeArrowheads="1"/>
+                    </pic:cNvPicPr>
+                  </pic:nvPicPr>
+                  <pic:blipFill>
+                    <a:blip r:embed="rId10" cstate="print">
+                      <a:extLst>
+                        <a:ext uri="{28A0092B-C50C-407E-A947-70E740481C1C}">
+                          <a14:useLocalDpi xmlns:a14="http://schemas.microsoft.com/office/drawing/2010/main" val="0"/>
+                        </a:ext>
+                      </a:extLst>
+                    </a:blip>
+                    <a:srcRect/>
+                    <a:stretch>
+                      <a:fillRect/>
+                    </a:stretch>
+                  </pic:blipFill>
+                  <pic:spPr bwMode="auto">
+                    <a:xfrm>
+                      <a:off x="0" y="0"/>
+                      <a:ext cx="8229600" cy="4936490"/>
+                    </a:xfrm>
+                    <a:prstGeom prst="rect">
+                      <a:avLst/>
+                    </a:prstGeom>
+                    <a:noFill/>
+                    <a:ln>
+                      <a:noFill/>
+                    </a:ln>
+                  </pic:spPr>
+                </pic:pic>
+              </a:graphicData>
+            </a:graphic>
+          </wp:inline>
+        </w:drawing>
+      </w:r>
+    </w:p>
+    <w:p>
+      <w:r>
+        <w:rPr>
+          <w:noProof/>
+        </w:rPr>
+        <w:lastRenderedPageBreak/>
+        <w:drawing>
+          <wp:inline distT="0" distB="0" distL="0" distR="0" wp14:anchorId="0844DB32" wp14:editId="497CBD24">
+            <wp:extent cx="8229600" cy="4936490"/>
+            <wp:effectExtent l="0" t="0" r="0" b="0"/>
+            <wp:docPr id="774453086" name="Picture 2"/>
+            <wp:cNvGraphicFramePr>
+              <a:graphicFrameLocks xmlns:a="http://schemas.openxmlformats.org/drawingml/2006/main" noChangeAspect="1"/>
+            </wp:cNvGraphicFramePr>
+            <a:graphic xmlns:a="http://schemas.openxmlformats.org/drawingml/2006/main">
+              <a:graphicData uri="http://schemas.openxmlformats.org/drawingml/2006/picture">
+                <pic:pic xmlns:pic="http://schemas.openxmlformats.org/drawingml/2006/picture">
+                  <pic:nvPicPr>
+                    <pic:cNvPr id="0" name="Picture 2"/>
+                    <pic:cNvPicPr>
+                      <a:picLocks noChangeAspect="1" noChangeArrowheads="1"/>
+                    </pic:cNvPicPr>
+                  </pic:nvPicPr>
+                  <pic:blipFill>
+                    <a:blip r:embed="rId11" cstate="print">
+                      <a:extLst>
+                        <a:ext uri="{28A0092B-C50C-407E-A947-70E740481C1C}">
+                          <a14:useLocalDpi xmlns:a14="http://schemas.microsoft.com/office/drawing/2010/main" val="0"/>
+                        </a:ext>
+                      </a:extLst>
+                    </a:blip>
+                    <a:srcRect/>
+                    <a:stretch>
+                      <a:fillRect/>
+                    </a:stretch>
+                  </pic:blipFill>
+                  <pic:spPr bwMode="auto">
+                    <a:xfrm>
+                      <a:off x="0" y="0"/>
+                      <a:ext cx="8229600" cy="4936490"/>
+                    </a:xfrm>
+                    <a:prstGeom prst="rect">
+                      <a:avLst/>
+                    </a:prstGeom>
+                    <a:noFill/>
+                    <a:ln>
+                      <a:noFill/>
+                    </a:ln>
+                  </pic:spPr>
+                </pic:pic>
+              </a:graphicData>
+            </a:graphic>
+          </wp:inline>
+        </w:drawing>
+      </w:r>
+    </w:p>
+    <w:p/>
+    <w:p/>
+    <w:p/>
+    <w:p>
+      <w:pPr>
+        <w:rPr>
+          <w:b/>
+          <w:bCs/>
+        </w:rPr>
+      </w:pPr>
+      <w:r>
+        <w:rPr>
+          <w:b/>
+          <w:bCs/>
+        </w:rPr>
+        <w:lastRenderedPageBreak/>
+        <w:t>OLDER GRAPHS:</w:t>
+      </w:r>
+    </w:p>
+    <w:p>
+      <w:r>
         <w:t xml:space="preserve">It looks like maybe SO4/Cl is increasing in the TR at GCW? </w:t>
       </w:r>
       <w:r>
@@ -84,7 +580,7 @@
                     </pic:cNvPicPr>
                   </pic:nvPicPr>
                   <pic:blipFill>
-                    <a:blip r:embed="rId5" cstate="print">
+                    <a:blip r:embed="rId12" cstate="print">
                       <a:extLst>
                         <a:ext uri="{28A0092B-C50C-407E-A947-70E740481C1C}">
                           <a14:useLocalDpi xmlns:a14="http://schemas.microsoft.com/office/drawing/2010/main" val="0"/>
@@ -147,7 +643,7 @@
                     </pic:cNvPicPr>
                   </pic:nvPicPr>
                   <pic:blipFill>
-                    <a:blip r:embed="rId6" cstate="print">
+                    <a:blip r:embed="rId13" cstate="print">
                       <a:extLst>
                         <a:ext uri="{28A0092B-C50C-407E-A947-70E740481C1C}">
                           <a14:useLocalDpi xmlns:a14="http://schemas.microsoft.com/office/drawing/2010/main" val="0"/>
@@ -188,7 +684,6 @@
     <w:p/>
     <w:p>
       <w:r>
-        <w:lastRenderedPageBreak/>
         <w:t xml:space="preserve">No pattern in DOC data? </w:t>
       </w:r>
     </w:p>
@@ -215,7 +710,7 @@
                     </pic:cNvPicPr>
                   </pic:nvPicPr>
                   <pic:blipFill>
-                    <a:blip r:embed="rId7" cstate="print">
+                    <a:blip r:embed="rId14" cstate="print">
                       <a:extLst>
                         <a:ext uri="{28A0092B-C50C-407E-A947-70E740481C1C}">
                           <a14:useLocalDpi xmlns:a14="http://schemas.microsoft.com/office/drawing/2010/main" val="0"/>
@@ -251,7 +746,6 @@
     <w:p/>
     <w:p>
       <w:r>
-        <w:lastRenderedPageBreak/>
         <w:t>DOC decreases as SO4 increases</w:t>
       </w:r>
       <w:r>
@@ -284,7 +778,7 @@
                     </pic:cNvPicPr>
                   </pic:nvPicPr>
                   <pic:blipFill>
-                    <a:blip r:embed="rId8" cstate="print">
+                    <a:blip r:embed="rId15" cstate="print">
                       <a:extLst>
                         <a:ext uri="{28A0092B-C50C-407E-A947-70E740481C1C}">
                           <a14:useLocalDpi xmlns:a14="http://schemas.microsoft.com/office/drawing/2010/main" val="0"/>
@@ -319,7 +813,6 @@
     <w:p/>
     <w:p>
       <w:r>
-        <w:lastRenderedPageBreak/>
         <w:t xml:space="preserve">No clear pattern in NPOC vs Cl? </w:t>
       </w:r>
     </w:p>
@@ -346,7 +839,7 @@
                     </pic:cNvPicPr>
                   </pic:nvPicPr>
                   <pic:blipFill>
-                    <a:blip r:embed="rId9" cstate="print">
+                    <a:blip r:embed="rId16" cstate="print">
                       <a:extLst>
                         <a:ext uri="{28A0092B-C50C-407E-A947-70E740481C1C}">
                           <a14:useLocalDpi xmlns:a14="http://schemas.microsoft.com/office/drawing/2010/main" val="0"/>
@@ -447,7 +940,7 @@
                     </pic:cNvPicPr>
                   </pic:nvPicPr>
                   <pic:blipFill>
-                    <a:blip r:embed="rId10" cstate="print">
+                    <a:blip r:embed="rId17" cstate="print">
                       <a:extLst>
                         <a:ext uri="{28A0092B-C50C-407E-A947-70E740481C1C}">
                           <a14:useLocalDpi xmlns:a14="http://schemas.microsoft.com/office/drawing/2010/main" val="0"/>

</xml_diff>

<commit_message>
Calculated and plotted sulfate depletion
</commit_message>
<xml_diff>
--- a/GCReW Symposium Ideas.docx
+++ b/GCReW Symposium Ideas.docx
@@ -23,11 +23,16 @@
           <w:numId w:val="1"/>
         </w:numPr>
       </w:pPr>
+      <w:proofErr w:type="gramStart"/>
       <w:r>
         <w:t>T</w:t>
       </w:r>
       <w:r>
-        <w:t>ake a look at synoptic site porewater data and look through the years to see if we are observing increases in specific analytes through time in the transition zones compared to uplands/wetlands. </w:t>
+        <w:t>ake a look</w:t>
+      </w:r>
+      <w:proofErr w:type="gramEnd"/>
+      <w:r>
+        <w:t xml:space="preserve"> at synoptic site porewater data and look through the years to see if we are observing increases in specific analytes through time in the transition zones compared to uplands/wetlands. </w:t>
       </w:r>
     </w:p>
     <w:p>
@@ -54,7 +59,23 @@
         <w:t>A</w:t>
       </w:r>
       <w:r>
-        <w:t>nalyses to look at variation through space and time. This would be comparing depths to see if there are significant differences across 10, 20, and 45cm. Also may look at interannual variation - do we see significant differences across years? what about zones? </w:t>
+        <w:t>nalyses to look at variation through space and time. This would be comparing depths to see if there are significant differences across 10, 20, and 45cm. </w:t>
+      </w:r>
+      <w:proofErr w:type="gramStart"/>
+      <w:r>
+        <w:t>Also</w:t>
+      </w:r>
+      <w:proofErr w:type="gramEnd"/>
+      <w:r>
+        <w:t xml:space="preserve"> may look at interannual variation - do we see significant differences across years? </w:t>
+      </w:r>
+      <w:proofErr w:type="gramStart"/>
+      <w:r>
+        <w:t>what</w:t>
+      </w:r>
+      <w:proofErr w:type="gramEnd"/>
+      <w:r>
+        <w:t xml:space="preserve"> about zones? </w:t>
       </w:r>
     </w:p>
     <w:p/>
@@ -85,25 +106,34 @@
         </w:rPr>
         <w:t xml:space="preserve"> GRAPHS:</w:t>
       </w:r>
-    </w:p>
-    <w:p>
-      <w:r>
-        <w:t xml:space="preserve">Plotted SO4/Cl through time as scatterplots: </w:t>
-      </w:r>
-      <w:r>
-        <w:t xml:space="preserve">There seems to be a seasonal trend but not so much a trend across years. </w:t>
-      </w:r>
-    </w:p>
-    <w:p>
-      <w:r>
+      <w:r>
+        <w:rPr>
+          <w:b/>
+          <w:bCs/>
+        </w:rPr>
+        <w:t xml:space="preserve"> </w:t>
+      </w:r>
+    </w:p>
+    <w:p>
+      <w:pPr>
         <w:rPr>
           <w:noProof/>
         </w:rPr>
+      </w:pPr>
+      <w:r>
+        <w:t xml:space="preserve">Plotted Sulfate depletion through time: </w:t>
+      </w:r>
+    </w:p>
+    <w:p>
+      <w:r>
+        <w:rPr>
+          <w:noProof/>
+        </w:rPr>
         <w:drawing>
-          <wp:inline distT="0" distB="0" distL="0" distR="0" wp14:anchorId="513DBC8F" wp14:editId="384DD942">
-            <wp:extent cx="8221345" cy="4931410"/>
-            <wp:effectExtent l="0" t="0" r="8255" b="2540"/>
-            <wp:docPr id="463213830" name="Picture 4"/>
+          <wp:inline distT="0" distB="0" distL="0" distR="0" wp14:anchorId="5D459B18" wp14:editId="0B3EB87C">
+            <wp:extent cx="8761228" cy="5252004"/>
+            <wp:effectExtent l="0" t="0" r="1905" b="6350"/>
+            <wp:docPr id="1421361094" name="Picture 2"/>
             <wp:cNvGraphicFramePr>
               <a:graphicFrameLocks xmlns:a="http://schemas.openxmlformats.org/drawingml/2006/main" noChangeAspect="1"/>
             </wp:cNvGraphicFramePr>
@@ -111,13 +141,13 @@
               <a:graphicData uri="http://schemas.openxmlformats.org/drawingml/2006/picture">
                 <pic:pic xmlns:pic="http://schemas.openxmlformats.org/drawingml/2006/picture">
                   <pic:nvPicPr>
-                    <pic:cNvPr id="0" name="Picture 4"/>
+                    <pic:cNvPr id="0" name="Picture 2"/>
                     <pic:cNvPicPr>
                       <a:picLocks noChangeAspect="1" noChangeArrowheads="1"/>
                     </pic:cNvPicPr>
                   </pic:nvPicPr>
                   <pic:blipFill>
-                    <a:blip r:embed="rId5" cstate="print">
+                    <a:blip r:embed="rId5">
                       <a:extLst>
                         <a:ext uri="{28A0092B-C50C-407E-A947-70E740481C1C}">
                           <a14:useLocalDpi xmlns:a14="http://schemas.microsoft.com/office/drawing/2010/main" val="0"/>
@@ -132,7 +162,7 @@
                   <pic:spPr bwMode="auto">
                     <a:xfrm>
                       <a:off x="0" y="0"/>
-                      <a:ext cx="8221345" cy="4931410"/>
+                      <a:ext cx="8775190" cy="5260374"/>
                     </a:xfrm>
                     <a:prstGeom prst="rect">
                       <a:avLst/>
@@ -149,17 +179,25 @@
         </w:drawing>
       </w:r>
     </w:p>
+    <w:p/>
+    <w:p>
+      <w:r>
+        <w:t xml:space="preserve">Plotted SO4/Cl through time as scatterplots: </w:t>
+      </w:r>
+      <w:r>
+        <w:t xml:space="preserve">There seems to be a seasonal trend but not so much a trend across years. </w:t>
+      </w:r>
+    </w:p>
     <w:p>
       <w:r>
         <w:rPr>
           <w:noProof/>
         </w:rPr>
-        <w:lastRenderedPageBreak/>
         <w:drawing>
-          <wp:inline distT="0" distB="0" distL="0" distR="0" wp14:anchorId="0645901A" wp14:editId="4B696611">
+          <wp:inline distT="0" distB="0" distL="0" distR="0" wp14:anchorId="513DBC8F" wp14:editId="384DD942">
             <wp:extent cx="8221345" cy="4931410"/>
             <wp:effectExtent l="0" t="0" r="8255" b="2540"/>
-            <wp:docPr id="467753390" name="Picture 5"/>
+            <wp:docPr id="463213830" name="Picture 4"/>
             <wp:cNvGraphicFramePr>
               <a:graphicFrameLocks xmlns:a="http://schemas.openxmlformats.org/drawingml/2006/main" noChangeAspect="1"/>
             </wp:cNvGraphicFramePr>
@@ -167,7 +205,7 @@
               <a:graphicData uri="http://schemas.openxmlformats.org/drawingml/2006/picture">
                 <pic:pic xmlns:pic="http://schemas.openxmlformats.org/drawingml/2006/picture">
                   <pic:nvPicPr>
-                    <pic:cNvPr id="0" name="Picture 5"/>
+                    <pic:cNvPr id="0" name="Picture 4"/>
                     <pic:cNvPicPr>
                       <a:picLocks noChangeAspect="1" noChangeArrowheads="1"/>
                     </pic:cNvPicPr>
@@ -205,40 +243,17 @@
         </w:drawing>
       </w:r>
     </w:p>
-    <w:p/>
-    <w:p>
-      <w:r>
-        <w:br w:type="page"/>
-      </w:r>
-    </w:p>
-    <w:p>
-      <w:r>
+    <w:p>
+      <w:r>
+        <w:rPr>
+          <w:noProof/>
+        </w:rPr>
         <w:lastRenderedPageBreak/>
-        <w:t>DOC vs SO4/Cl for only Transition Zones</w:t>
-      </w:r>
-      <w:r>
-        <w:t xml:space="preserve">: Looks like a generally </w:t>
-      </w:r>
-      <w:r>
-        <w:t>inverse</w:t>
-      </w:r>
-      <w:r>
-        <w:t xml:space="preserve"> relationship</w:t>
-      </w:r>
-      <w:r>
-        <w:t xml:space="preserve">. </w:t>
-      </w:r>
-    </w:p>
-    <w:p>
-      <w:r>
-        <w:rPr>
-          <w:noProof/>
-        </w:rPr>
         <w:drawing>
-          <wp:inline distT="0" distB="0" distL="0" distR="0" wp14:anchorId="356AA856" wp14:editId="1635983D">
-            <wp:extent cx="8229600" cy="4937760"/>
-            <wp:effectExtent l="0" t="0" r="0" b="0"/>
-            <wp:docPr id="527517431" name="Picture 6"/>
+          <wp:inline distT="0" distB="0" distL="0" distR="0" wp14:anchorId="0645901A" wp14:editId="4B696611">
+            <wp:extent cx="8221345" cy="4931410"/>
+            <wp:effectExtent l="0" t="0" r="8255" b="2540"/>
+            <wp:docPr id="467753390" name="Picture 5"/>
             <wp:cNvGraphicFramePr>
               <a:graphicFrameLocks xmlns:a="http://schemas.openxmlformats.org/drawingml/2006/main" noChangeAspect="1"/>
             </wp:cNvGraphicFramePr>
@@ -246,7 +261,7 @@
               <a:graphicData uri="http://schemas.openxmlformats.org/drawingml/2006/picture">
                 <pic:pic xmlns:pic="http://schemas.openxmlformats.org/drawingml/2006/picture">
                   <pic:nvPicPr>
-                    <pic:cNvPr id="0" name="Picture 6"/>
+                    <pic:cNvPr id="0" name="Picture 5"/>
                     <pic:cNvPicPr>
                       <a:picLocks noChangeAspect="1" noChangeArrowheads="1"/>
                     </pic:cNvPicPr>
@@ -267,7 +282,7 @@
                   <pic:spPr bwMode="auto">
                     <a:xfrm>
                       <a:off x="0" y="0"/>
-                      <a:ext cx="8229600" cy="4937760"/>
+                      <a:ext cx="8221345" cy="4931410"/>
                     </a:xfrm>
                     <a:prstGeom prst="rect">
                       <a:avLst/>
@@ -284,17 +299,40 @@
         </w:drawing>
       </w:r>
     </w:p>
+    <w:p/>
+    <w:p>
+      <w:r>
+        <w:br w:type="page"/>
+      </w:r>
+    </w:p>
+    <w:p>
+      <w:r>
+        <w:lastRenderedPageBreak/>
+        <w:t>DOC vs SO4/Cl for only Transition Zones</w:t>
+      </w:r>
+      <w:r>
+        <w:t xml:space="preserve">: Looks like a generally </w:t>
+      </w:r>
+      <w:r>
+        <w:t>inverse</w:t>
+      </w:r>
+      <w:r>
+        <w:t xml:space="preserve"> relationship</w:t>
+      </w:r>
+      <w:r>
+        <w:t xml:space="preserve">. </w:t>
+      </w:r>
+    </w:p>
     <w:p>
       <w:r>
         <w:rPr>
           <w:noProof/>
         </w:rPr>
-        <w:lastRenderedPageBreak/>
         <w:drawing>
-          <wp:inline distT="0" distB="0" distL="0" distR="0" wp14:anchorId="5F176FA7" wp14:editId="758B479A">
+          <wp:inline distT="0" distB="0" distL="0" distR="0" wp14:anchorId="356AA856" wp14:editId="1635983D">
             <wp:extent cx="8229600" cy="4937760"/>
             <wp:effectExtent l="0" t="0" r="0" b="0"/>
-            <wp:docPr id="1644211787" name="Picture 7"/>
+            <wp:docPr id="527517431" name="Picture 6"/>
             <wp:cNvGraphicFramePr>
               <a:graphicFrameLocks xmlns:a="http://schemas.openxmlformats.org/drawingml/2006/main" noChangeAspect="1"/>
             </wp:cNvGraphicFramePr>
@@ -302,7 +340,7 @@
               <a:graphicData uri="http://schemas.openxmlformats.org/drawingml/2006/picture">
                 <pic:pic xmlns:pic="http://schemas.openxmlformats.org/drawingml/2006/picture">
                   <pic:nvPicPr>
-                    <pic:cNvPr id="0" name="Picture 7"/>
+                    <pic:cNvPr id="0" name="Picture 6"/>
                     <pic:cNvPicPr>
                       <a:picLocks noChangeAspect="1" noChangeArrowheads="1"/>
                     </pic:cNvPicPr>
@@ -340,28 +378,17 @@
         </w:drawing>
       </w:r>
     </w:p>
-    <w:p/>
-    <w:p/>
-    <w:p/>
-    <w:p>
-      <w:r>
+    <w:p>
+      <w:r>
+        <w:rPr>
+          <w:noProof/>
+        </w:rPr>
         <w:lastRenderedPageBreak/>
-        <w:t xml:space="preserve">Graphed SO4 vs H2S in Transition Zones: </w:t>
-      </w:r>
-      <w:r>
-        <w:t xml:space="preserve">It seems to be a generally inverse relationship, as expected. </w:t>
-      </w:r>
-    </w:p>
-    <w:p>
-      <w:r>
-        <w:rPr>
-          <w:noProof/>
-        </w:rPr>
         <w:drawing>
-          <wp:inline distT="0" distB="0" distL="0" distR="0" wp14:anchorId="5C88333E" wp14:editId="7C5080E2">
-            <wp:extent cx="8229600" cy="4936490"/>
+          <wp:inline distT="0" distB="0" distL="0" distR="0" wp14:anchorId="5F176FA7" wp14:editId="758B479A">
+            <wp:extent cx="8229600" cy="4937760"/>
             <wp:effectExtent l="0" t="0" r="0" b="0"/>
-            <wp:docPr id="174758582" name="Picture 9"/>
+            <wp:docPr id="1644211787" name="Picture 7"/>
             <wp:cNvGraphicFramePr>
               <a:graphicFrameLocks xmlns:a="http://schemas.openxmlformats.org/drawingml/2006/main" noChangeAspect="1"/>
             </wp:cNvGraphicFramePr>
@@ -369,7 +396,7 @@
               <a:graphicData uri="http://schemas.openxmlformats.org/drawingml/2006/picture">
                 <pic:pic xmlns:pic="http://schemas.openxmlformats.org/drawingml/2006/picture">
                   <pic:nvPicPr>
-                    <pic:cNvPr id="0" name="Picture 9"/>
+                    <pic:cNvPr id="0" name="Picture 7"/>
                     <pic:cNvPicPr>
                       <a:picLocks noChangeAspect="1" noChangeArrowheads="1"/>
                     </pic:cNvPicPr>
@@ -390,7 +417,7 @@
                   <pic:spPr bwMode="auto">
                     <a:xfrm>
                       <a:off x="0" y="0"/>
-                      <a:ext cx="8229600" cy="4936490"/>
+                      <a:ext cx="8229600" cy="4937760"/>
                     </a:xfrm>
                     <a:prstGeom prst="rect">
                       <a:avLst/>
@@ -409,16 +436,14 @@
     </w:p>
     <w:p/>
     <w:p/>
+    <w:p/>
     <w:p>
       <w:r>
         <w:lastRenderedPageBreak/>
-        <w:t>H2S and SO4 vs Depth</w:t>
-      </w:r>
-      <w:r>
-        <w:t xml:space="preserve">: </w:t>
-      </w:r>
-      <w:r>
-        <w:t xml:space="preserve">Looks like SO4 decreases and H2S increases with depth. </w:t>
+        <w:t xml:space="preserve">Graphed SO4 vs H2S in Transition Zones: </w:t>
+      </w:r>
+      <w:r>
+        <w:t xml:space="preserve">It seems to be a generally inverse relationship, as expected. </w:t>
       </w:r>
     </w:p>
     <w:p>
@@ -427,10 +452,10 @@
           <w:noProof/>
         </w:rPr>
         <w:drawing>
-          <wp:inline distT="0" distB="0" distL="0" distR="0" wp14:anchorId="76AD92EF" wp14:editId="6FC98732">
+          <wp:inline distT="0" distB="0" distL="0" distR="0" wp14:anchorId="5C88333E" wp14:editId="7C5080E2">
             <wp:extent cx="8229600" cy="4936490"/>
             <wp:effectExtent l="0" t="0" r="0" b="0"/>
-            <wp:docPr id="1994057191" name="Picture 1"/>
+            <wp:docPr id="174758582" name="Picture 9"/>
             <wp:cNvGraphicFramePr>
               <a:graphicFrameLocks xmlns:a="http://schemas.openxmlformats.org/drawingml/2006/main" noChangeAspect="1"/>
             </wp:cNvGraphicFramePr>
@@ -438,7 +463,7 @@
               <a:graphicData uri="http://schemas.openxmlformats.org/drawingml/2006/picture">
                 <pic:pic xmlns:pic="http://schemas.openxmlformats.org/drawingml/2006/picture">
                   <pic:nvPicPr>
-                    <pic:cNvPr id="0" name="Picture 1"/>
+                    <pic:cNvPr id="0" name="Picture 9"/>
                     <pic:cNvPicPr>
                       <a:picLocks noChangeAspect="1" noChangeArrowheads="1"/>
                     </pic:cNvPicPr>
@@ -476,17 +501,30 @@
         </w:drawing>
       </w:r>
     </w:p>
+    <w:p/>
+    <w:p/>
+    <w:p>
+      <w:r>
+        <w:lastRenderedPageBreak/>
+        <w:t>H2S and SO4 vs Depth</w:t>
+      </w:r>
+      <w:r>
+        <w:t xml:space="preserve">: </w:t>
+      </w:r>
+      <w:r>
+        <w:t xml:space="preserve">Looks like SO4 decreases and H2S increases with depth. </w:t>
+      </w:r>
+    </w:p>
     <w:p>
       <w:r>
         <w:rPr>
           <w:noProof/>
         </w:rPr>
-        <w:lastRenderedPageBreak/>
         <w:drawing>
-          <wp:inline distT="0" distB="0" distL="0" distR="0" wp14:anchorId="0844DB32" wp14:editId="497CBD24">
+          <wp:inline distT="0" distB="0" distL="0" distR="0" wp14:anchorId="76AD92EF" wp14:editId="6FC98732">
             <wp:extent cx="8229600" cy="4936490"/>
             <wp:effectExtent l="0" t="0" r="0" b="0"/>
-            <wp:docPr id="774453086" name="Picture 2"/>
+            <wp:docPr id="1994057191" name="Picture 1"/>
             <wp:cNvGraphicFramePr>
               <a:graphicFrameLocks xmlns:a="http://schemas.openxmlformats.org/drawingml/2006/main" noChangeAspect="1"/>
             </wp:cNvGraphicFramePr>
@@ -494,7 +532,7 @@
               <a:graphicData uri="http://schemas.openxmlformats.org/drawingml/2006/picture">
                 <pic:pic xmlns:pic="http://schemas.openxmlformats.org/drawingml/2006/picture">
                   <pic:nvPicPr>
-                    <pic:cNvPr id="0" name="Picture 2"/>
+                    <pic:cNvPr id="0" name="Picture 1"/>
                     <pic:cNvPicPr>
                       <a:picLocks noChangeAspect="1" noChangeArrowheads="1"/>
                     </pic:cNvPicPr>
@@ -532,6 +570,62 @@
         </w:drawing>
       </w:r>
     </w:p>
+    <w:p>
+      <w:r>
+        <w:rPr>
+          <w:noProof/>
+        </w:rPr>
+        <w:lastRenderedPageBreak/>
+        <w:drawing>
+          <wp:inline distT="0" distB="0" distL="0" distR="0" wp14:anchorId="0844DB32" wp14:editId="497CBD24">
+            <wp:extent cx="8229600" cy="4936490"/>
+            <wp:effectExtent l="0" t="0" r="0" b="0"/>
+            <wp:docPr id="774453086" name="Picture 2"/>
+            <wp:cNvGraphicFramePr>
+              <a:graphicFrameLocks xmlns:a="http://schemas.openxmlformats.org/drawingml/2006/main" noChangeAspect="1"/>
+            </wp:cNvGraphicFramePr>
+            <a:graphic xmlns:a="http://schemas.openxmlformats.org/drawingml/2006/main">
+              <a:graphicData uri="http://schemas.openxmlformats.org/drawingml/2006/picture">
+                <pic:pic xmlns:pic="http://schemas.openxmlformats.org/drawingml/2006/picture">
+                  <pic:nvPicPr>
+                    <pic:cNvPr id="0" name="Picture 2"/>
+                    <pic:cNvPicPr>
+                      <a:picLocks noChangeAspect="1" noChangeArrowheads="1"/>
+                    </pic:cNvPicPr>
+                  </pic:nvPicPr>
+                  <pic:blipFill>
+                    <a:blip r:embed="rId12" cstate="print">
+                      <a:extLst>
+                        <a:ext uri="{28A0092B-C50C-407E-A947-70E740481C1C}">
+                          <a14:useLocalDpi xmlns:a14="http://schemas.microsoft.com/office/drawing/2010/main" val="0"/>
+                        </a:ext>
+                      </a:extLst>
+                    </a:blip>
+                    <a:srcRect/>
+                    <a:stretch>
+                      <a:fillRect/>
+                    </a:stretch>
+                  </pic:blipFill>
+                  <pic:spPr bwMode="auto">
+                    <a:xfrm>
+                      <a:off x="0" y="0"/>
+                      <a:ext cx="8229600" cy="4936490"/>
+                    </a:xfrm>
+                    <a:prstGeom prst="rect">
+                      <a:avLst/>
+                    </a:prstGeom>
+                    <a:noFill/>
+                    <a:ln>
+                      <a:noFill/>
+                    </a:ln>
+                  </pic:spPr>
+                </pic:pic>
+              </a:graphicData>
+            </a:graphic>
+          </wp:inline>
+        </w:drawing>
+      </w:r>
+    </w:p>
     <w:p/>
     <w:p/>
     <w:p/>
@@ -580,7 +674,7 @@
                     </pic:cNvPicPr>
                   </pic:nvPicPr>
                   <pic:blipFill>
-                    <a:blip r:embed="rId12" cstate="print">
+                    <a:blip r:embed="rId13" cstate="print">
                       <a:extLst>
                         <a:ext uri="{28A0092B-C50C-407E-A947-70E740481C1C}">
                           <a14:useLocalDpi xmlns:a14="http://schemas.microsoft.com/office/drawing/2010/main" val="0"/>
@@ -643,7 +737,7 @@
                     </pic:cNvPicPr>
                   </pic:nvPicPr>
                   <pic:blipFill>
-                    <a:blip r:embed="rId13" cstate="print">
+                    <a:blip r:embed="rId14" cstate="print">
                       <a:extLst>
                         <a:ext uri="{28A0092B-C50C-407E-A947-70E740481C1C}">
                           <a14:useLocalDpi xmlns:a14="http://schemas.microsoft.com/office/drawing/2010/main" val="0"/>
@@ -710,7 +804,7 @@
                     </pic:cNvPicPr>
                   </pic:nvPicPr>
                   <pic:blipFill>
-                    <a:blip r:embed="rId14" cstate="print">
+                    <a:blip r:embed="rId15" cstate="print">
                       <a:extLst>
                         <a:ext uri="{28A0092B-C50C-407E-A947-70E740481C1C}">
                           <a14:useLocalDpi xmlns:a14="http://schemas.microsoft.com/office/drawing/2010/main" val="0"/>
@@ -778,7 +872,7 @@
                     </pic:cNvPicPr>
                   </pic:nvPicPr>
                   <pic:blipFill>
-                    <a:blip r:embed="rId15" cstate="print">
+                    <a:blip r:embed="rId16" cstate="print">
                       <a:extLst>
                         <a:ext uri="{28A0092B-C50C-407E-A947-70E740481C1C}">
                           <a14:useLocalDpi xmlns:a14="http://schemas.microsoft.com/office/drawing/2010/main" val="0"/>
@@ -839,7 +933,7 @@
                     </pic:cNvPicPr>
                   </pic:nvPicPr>
                   <pic:blipFill>
-                    <a:blip r:embed="rId16" cstate="print">
+                    <a:blip r:embed="rId17" cstate="print">
                       <a:extLst>
                         <a:ext uri="{28A0092B-C50C-407E-A947-70E740481C1C}">
                           <a14:useLocalDpi xmlns:a14="http://schemas.microsoft.com/office/drawing/2010/main" val="0"/>
@@ -940,7 +1034,7 @@
                     </pic:cNvPicPr>
                   </pic:nvPicPr>
                   <pic:blipFill>
-                    <a:blip r:embed="rId17" cstate="print">
+                    <a:blip r:embed="rId18" cstate="print">
                       <a:extLst>
                         <a:ext uri="{28A0092B-C50C-407E-A947-70E740481C1C}">
                           <a14:useLocalDpi xmlns:a14="http://schemas.microsoft.com/office/drawing/2010/main" val="0"/>

</xml_diff>